<commit_message>
Documenta a emenda dos contínuos e destrava o coletor fora da main
O passo de commit do workflow rebaseava sobre 'main' fixo, o que quebrava
qualquer execução em outro branch (cinco conflitos add/add). Passa a usar o
branch corrente, para dar para verificar uma mudança antes do merge.

Documentação: tabela dos meses do milho, nova seção 8.5 sobre contínuos vs.
contratos com o caso do salto de 25/08, e a limitação correspondente na
seção 9.

Co-Authored-By: Claude Opus 5 <noreply@anthropic.com>
Claude-Session: https://claude.ai/code/session_017Li1vifVFsinU57np59GoL
</commit_message>
<xml_diff>
--- a/docs/Painel-Soja-Documentacao.docx
+++ b/docs/Painel-Soja-Documentacao.docx
@@ -514,7 +514,7 @@
                 <w:sz w:val="19"/>
                 <w:szCs w:val="19"/>
               </w:rPr>
-              <w:t xml:space="preserve">24/08/2026</w:t>
+              <w:t xml:space="preserve">25/08/2026</w:t>
             </w:r>
           </w:p>
         </w:tc>
@@ -7271,7 +7271,20 @@
           <w:sz w:val="21"/>
           <w:szCs w:val="21"/>
         </w:rPr>
-        <w:t xml:space="preserve">A soja negocia em sete meses de vencimento, com códigos herdados do pregão viva-voz:</w:t>
+        <w:t xml:space="preserve">A soja negocia em sete meses de vencimento e o milho em cinco, com códigos herdados do pregão viva-voz. Os calendários são diferentes porque cada grão segue o seu ciclo: a soja acompanha o esmagamento, o milho a colheita americana.</w:t>
+      </w:r>
+    </w:p>
+    <w:p>
+      <w:pPr>
+        <w:spacing w:after="120" w:line="276"/>
+      </w:pPr>
+      <w:r>
+        <w:rPr>
+          <w:color w:val="1A1A1A"/>
+          <w:sz w:val="21"/>
+          <w:szCs w:val="21"/>
+        </w:rPr>
+        <w:t xml:space="preserve">Soja:</w:t>
       </w:r>
     </w:p>
     <w:tbl>
@@ -7953,7 +7966,555 @@
           <w:sz w:val="21"/>
           <w:szCs w:val="21"/>
         </w:rPr>
+        <w:t xml:space="preserve">Milho:</w:t>
+      </w:r>
+    </w:p>
+    <w:tbl>
+      <w:tblPr>
+        <w:tblW w:type="dxa" w:w="9360"/>
+        <w:tblBorders>
+          <w:top w:val="single" w:color="D5D5CE" w:sz="2"/>
+          <w:left w:val="single" w:color="D5D5CE" w:sz="2"/>
+          <w:bottom w:val="single" w:color="D5D5CE" w:sz="2"/>
+          <w:right w:val="single" w:color="D5D5CE" w:sz="2"/>
+          <w:insideH w:val="single" w:color="E6E6E0" w:sz="2"/>
+          <w:insideV w:val="single" w:color="E6E6E0" w:sz="2"/>
+        </w:tblBorders>
+      </w:tblPr>
+      <w:tblGrid>
+        <w:gridCol w:w="1310"/>
+        <w:gridCol w:w="1872"/>
+        <w:gridCol w:w="6178"/>
+      </w:tblGrid>
+      <w:tr>
+        <w:trPr>
+          <w:tblHeader/>
+        </w:trPr>
+        <w:tc>
+          <w:tcPr>
+            <w:tcW w:type="dxa" w:w="1310"/>
+            <w:shd w:fill="EDF2ED" w:color="auto" w:val="clear"/>
+            <w:tcMar>
+              <w:top w:type="dxa" w:w="80"/>
+              <w:left w:type="dxa" w:w="110"/>
+              <w:bottom w:type="dxa" w:w="80"/>
+              <w:right w:type="dxa" w:w="110"/>
+            </w:tcMar>
+          </w:tcPr>
+          <w:p>
+            <w:pPr>
+              <w:spacing w:after="0" w:line="264"/>
+            </w:pPr>
+            <w:r>
+              <w:rPr>
+                <w:b/>
+                <w:bCs/>
+                <w:color w:val="2E6B3E"/>
+                <w:sz w:val="19"/>
+                <w:szCs w:val="19"/>
+              </w:rPr>
+              <w:t xml:space="preserve">Código</w:t>
+            </w:r>
+          </w:p>
+        </w:tc>
+        <w:tc>
+          <w:tcPr>
+            <w:tcW w:type="dxa" w:w="1872"/>
+            <w:shd w:fill="EDF2ED" w:color="auto" w:val="clear"/>
+            <w:tcMar>
+              <w:top w:type="dxa" w:w="80"/>
+              <w:left w:type="dxa" w:w="110"/>
+              <w:bottom w:type="dxa" w:w="80"/>
+              <w:right w:type="dxa" w:w="110"/>
+            </w:tcMar>
+          </w:tcPr>
+          <w:p>
+            <w:pPr>
+              <w:spacing w:after="0" w:line="264"/>
+            </w:pPr>
+            <w:r>
+              <w:rPr>
+                <w:b/>
+                <w:bCs/>
+                <w:color w:val="2E6B3E"/>
+                <w:sz w:val="19"/>
+                <w:szCs w:val="19"/>
+              </w:rPr>
+              <w:t xml:space="preserve">Mês</w:t>
+            </w:r>
+          </w:p>
+        </w:tc>
+        <w:tc>
+          <w:tcPr>
+            <w:tcW w:type="dxa" w:w="6178"/>
+            <w:shd w:fill="EDF2ED" w:color="auto" w:val="clear"/>
+            <w:tcMar>
+              <w:top w:type="dxa" w:w="80"/>
+              <w:left w:type="dxa" w:w="110"/>
+              <w:bottom w:type="dxa" w:w="80"/>
+              <w:right w:type="dxa" w:w="110"/>
+            </w:tcMar>
+          </w:tcPr>
+          <w:p>
+            <w:pPr>
+              <w:spacing w:after="0" w:line="264"/>
+            </w:pPr>
+            <w:r>
+              <w:rPr>
+                <w:b/>
+                <w:bCs/>
+                <w:color w:val="2E6B3E"/>
+                <w:sz w:val="19"/>
+                <w:szCs w:val="19"/>
+              </w:rPr>
+              <w:t xml:space="preserve">Papel no ciclo</w:t>
+            </w:r>
+          </w:p>
+        </w:tc>
+      </w:tr>
+      <w:tr>
+        <w:tc>
+          <w:tcPr>
+            <w:tcW w:type="dxa" w:w="1310"/>
+            <w:tcMar>
+              <w:top w:type="dxa" w:w="80"/>
+              <w:left w:type="dxa" w:w="110"/>
+              <w:bottom w:type="dxa" w:w="80"/>
+              <w:right w:type="dxa" w:w="110"/>
+            </w:tcMar>
+          </w:tcPr>
+          <w:p>
+            <w:pPr>
+              <w:spacing w:after="0" w:line="264"/>
+            </w:pPr>
+            <w:r>
+              <w:rPr>
+                <w:b w:val="false"/>
+                <w:bCs w:val="false"/>
+                <w:color w:val="1A1A1A"/>
+                <w:sz w:val="19"/>
+                <w:szCs w:val="19"/>
+              </w:rPr>
+              <w:t xml:space="preserve">H</w:t>
+            </w:r>
+          </w:p>
+        </w:tc>
+        <w:tc>
+          <w:tcPr>
+            <w:tcW w:type="dxa" w:w="1872"/>
+            <w:tcMar>
+              <w:top w:type="dxa" w:w="80"/>
+              <w:left w:type="dxa" w:w="110"/>
+              <w:bottom w:type="dxa" w:w="80"/>
+              <w:right w:type="dxa" w:w="110"/>
+            </w:tcMar>
+          </w:tcPr>
+          <w:p>
+            <w:pPr>
+              <w:spacing w:after="0" w:line="264"/>
+            </w:pPr>
+            <w:r>
+              <w:rPr>
+                <w:b w:val="false"/>
+                <w:bCs w:val="false"/>
+                <w:color w:val="1A1A1A"/>
+                <w:sz w:val="19"/>
+                <w:szCs w:val="19"/>
+              </w:rPr>
+              <w:t xml:space="preserve">março</w:t>
+            </w:r>
+          </w:p>
+        </w:tc>
+        <w:tc>
+          <w:tcPr>
+            <w:tcW w:type="dxa" w:w="6178"/>
+            <w:tcMar>
+              <w:top w:type="dxa" w:w="80"/>
+              <w:left w:type="dxa" w:w="110"/>
+              <w:bottom w:type="dxa" w:w="80"/>
+              <w:right w:type="dxa" w:w="110"/>
+            </w:tcMar>
+          </w:tcPr>
+          <w:p>
+            <w:pPr>
+              <w:spacing w:after="0" w:line="264"/>
+            </w:pPr>
+            <w:r>
+              <w:rPr>
+                <w:b w:val="false"/>
+                <w:bCs w:val="false"/>
+                <w:color w:val="1A1A1A"/>
+                <w:sz w:val="19"/>
+                <w:szCs w:val="19"/>
+              </w:rPr>
+              <w:t xml:space="preserve">Safra velha americana, escoamento do estoque de inverno</w:t>
+            </w:r>
+          </w:p>
+        </w:tc>
+      </w:tr>
+      <w:tr>
+        <w:tc>
+          <w:tcPr>
+            <w:tcW w:type="dxa" w:w="1310"/>
+            <w:tcMar>
+              <w:top w:type="dxa" w:w="80"/>
+              <w:left w:type="dxa" w:w="110"/>
+              <w:bottom w:type="dxa" w:w="80"/>
+              <w:right w:type="dxa" w:w="110"/>
+            </w:tcMar>
+          </w:tcPr>
+          <w:p>
+            <w:pPr>
+              <w:spacing w:after="0" w:line="264"/>
+            </w:pPr>
+            <w:r>
+              <w:rPr>
+                <w:b w:val="false"/>
+                <w:bCs w:val="false"/>
+                <w:color w:val="1A1A1A"/>
+                <w:sz w:val="19"/>
+                <w:szCs w:val="19"/>
+              </w:rPr>
+              <w:t xml:space="preserve">K</w:t>
+            </w:r>
+          </w:p>
+        </w:tc>
+        <w:tc>
+          <w:tcPr>
+            <w:tcW w:type="dxa" w:w="1872"/>
+            <w:tcMar>
+              <w:top w:type="dxa" w:w="80"/>
+              <w:left w:type="dxa" w:w="110"/>
+              <w:bottom w:type="dxa" w:w="80"/>
+              <w:right w:type="dxa" w:w="110"/>
+            </w:tcMar>
+          </w:tcPr>
+          <w:p>
+            <w:pPr>
+              <w:spacing w:after="0" w:line="264"/>
+            </w:pPr>
+            <w:r>
+              <w:rPr>
+                <w:b w:val="false"/>
+                <w:bCs w:val="false"/>
+                <w:color w:val="1A1A1A"/>
+                <w:sz w:val="19"/>
+                <w:szCs w:val="19"/>
+              </w:rPr>
+              <w:t xml:space="preserve">maio</w:t>
+            </w:r>
+          </w:p>
+        </w:tc>
+        <w:tc>
+          <w:tcPr>
+            <w:tcW w:type="dxa" w:w="6178"/>
+            <w:tcMar>
+              <w:top w:type="dxa" w:w="80"/>
+              <w:left w:type="dxa" w:w="110"/>
+              <w:bottom w:type="dxa" w:w="80"/>
+              <w:right w:type="dxa" w:w="110"/>
+            </w:tcMar>
+          </w:tcPr>
+          <w:p>
+            <w:pPr>
+              <w:spacing w:after="0" w:line="264"/>
+            </w:pPr>
+            <w:r>
+              <w:rPr>
+                <w:b w:val="false"/>
+                <w:bCs w:val="false"/>
+                <w:color w:val="1A1A1A"/>
+                <w:sz w:val="19"/>
+                <w:szCs w:val="19"/>
+              </w:rPr>
+              <w:t xml:space="preserve">Referência da safra velha, antes do plantio americano definir a nova</w:t>
+            </w:r>
+          </w:p>
+        </w:tc>
+      </w:tr>
+      <w:tr>
+        <w:tc>
+          <w:tcPr>
+            <w:tcW w:type="dxa" w:w="1310"/>
+            <w:tcMar>
+              <w:top w:type="dxa" w:w="80"/>
+              <w:left w:type="dxa" w:w="110"/>
+              <w:bottom w:type="dxa" w:w="80"/>
+              <w:right w:type="dxa" w:w="110"/>
+            </w:tcMar>
+          </w:tcPr>
+          <w:p>
+            <w:pPr>
+              <w:spacing w:after="0" w:line="264"/>
+            </w:pPr>
+            <w:r>
+              <w:rPr>
+                <w:b w:val="false"/>
+                <w:bCs w:val="false"/>
+                <w:color w:val="1A1A1A"/>
+                <w:sz w:val="19"/>
+                <w:szCs w:val="19"/>
+              </w:rPr>
+              <w:t xml:space="preserve">N</w:t>
+            </w:r>
+          </w:p>
+        </w:tc>
+        <w:tc>
+          <w:tcPr>
+            <w:tcW w:type="dxa" w:w="1872"/>
+            <w:tcMar>
+              <w:top w:type="dxa" w:w="80"/>
+              <w:left w:type="dxa" w:w="110"/>
+              <w:bottom w:type="dxa" w:w="80"/>
+              <w:right w:type="dxa" w:w="110"/>
+            </w:tcMar>
+          </w:tcPr>
+          <w:p>
+            <w:pPr>
+              <w:spacing w:after="0" w:line="264"/>
+            </w:pPr>
+            <w:r>
+              <w:rPr>
+                <w:b w:val="false"/>
+                <w:bCs w:val="false"/>
+                <w:color w:val="1A1A1A"/>
+                <w:sz w:val="19"/>
+                <w:szCs w:val="19"/>
+              </w:rPr>
+              <w:t xml:space="preserve">julho</w:t>
+            </w:r>
+          </w:p>
+        </w:tc>
+        <w:tc>
+          <w:tcPr>
+            <w:tcW w:type="dxa" w:w="6178"/>
+            <w:tcMar>
+              <w:top w:type="dxa" w:w="80"/>
+              <w:left w:type="dxa" w:w="110"/>
+              <w:bottom w:type="dxa" w:w="80"/>
+              <w:right w:type="dxa" w:w="110"/>
+            </w:tcMar>
+          </w:tcPr>
+          <w:p>
+            <w:pPr>
+              <w:spacing w:after="0" w:line="264"/>
+            </w:pPr>
+            <w:r>
+              <w:rPr>
+                <w:b w:val="false"/>
+                <w:bCs w:val="false"/>
+                <w:color w:val="1A1A1A"/>
+                <w:sz w:val="19"/>
+                <w:szCs w:val="19"/>
+              </w:rPr>
+              <w:t xml:space="preserve">Polinização nos EUA — o contrato mais sensível a clima do ano</w:t>
+            </w:r>
+          </w:p>
+        </w:tc>
+      </w:tr>
+      <w:tr>
+        <w:tc>
+          <w:tcPr>
+            <w:tcW w:type="dxa" w:w="1310"/>
+            <w:tcMar>
+              <w:top w:type="dxa" w:w="80"/>
+              <w:left w:type="dxa" w:w="110"/>
+              <w:bottom w:type="dxa" w:w="80"/>
+              <w:right w:type="dxa" w:w="110"/>
+            </w:tcMar>
+          </w:tcPr>
+          <w:p>
+            <w:pPr>
+              <w:spacing w:after="0" w:line="264"/>
+            </w:pPr>
+            <w:r>
+              <w:rPr>
+                <w:b w:val="false"/>
+                <w:bCs w:val="false"/>
+                <w:color w:val="1A1A1A"/>
+                <w:sz w:val="19"/>
+                <w:szCs w:val="19"/>
+              </w:rPr>
+              <w:t xml:space="preserve">U</w:t>
+            </w:r>
+          </w:p>
+        </w:tc>
+        <w:tc>
+          <w:tcPr>
+            <w:tcW w:type="dxa" w:w="1872"/>
+            <w:tcMar>
+              <w:top w:type="dxa" w:w="80"/>
+              <w:left w:type="dxa" w:w="110"/>
+              <w:bottom w:type="dxa" w:w="80"/>
+              <w:right w:type="dxa" w:w="110"/>
+            </w:tcMar>
+          </w:tcPr>
+          <w:p>
+            <w:pPr>
+              <w:spacing w:after="0" w:line="264"/>
+            </w:pPr>
+            <w:r>
+              <w:rPr>
+                <w:b w:val="false"/>
+                <w:bCs w:val="false"/>
+                <w:color w:val="1A1A1A"/>
+                <w:sz w:val="19"/>
+                <w:szCs w:val="19"/>
+              </w:rPr>
+              <w:t xml:space="preserve">setembro</w:t>
+            </w:r>
+          </w:p>
+        </w:tc>
+        <w:tc>
+          <w:tcPr>
+            <w:tcW w:type="dxa" w:w="6178"/>
+            <w:tcMar>
+              <w:top w:type="dxa" w:w="80"/>
+              <w:left w:type="dxa" w:w="110"/>
+              <w:bottom w:type="dxa" w:w="80"/>
+              <w:right w:type="dxa" w:w="110"/>
+            </w:tcMar>
+          </w:tcPr>
+          <w:p>
+            <w:pPr>
+              <w:spacing w:after="0" w:line="264"/>
+            </w:pPr>
+            <w:r>
+              <w:rPr>
+                <w:b w:val="false"/>
+                <w:bCs w:val="false"/>
+                <w:color w:val="1A1A1A"/>
+                <w:sz w:val="19"/>
+                <w:szCs w:val="19"/>
+              </w:rPr>
+              <w:t xml:space="preserve">Transição, início da colheita americana; liquidez baixa</w:t>
+            </w:r>
+          </w:p>
+        </w:tc>
+      </w:tr>
+      <w:tr>
+        <w:tc>
+          <w:tcPr>
+            <w:tcW w:type="dxa" w:w="1310"/>
+            <w:tcMar>
+              <w:top w:type="dxa" w:w="80"/>
+              <w:left w:type="dxa" w:w="110"/>
+              <w:bottom w:type="dxa" w:w="80"/>
+              <w:right w:type="dxa" w:w="110"/>
+            </w:tcMar>
+          </w:tcPr>
+          <w:p>
+            <w:pPr>
+              <w:spacing w:after="0" w:line="264"/>
+            </w:pPr>
+            <w:r>
+              <w:rPr>
+                <w:b w:val="false"/>
+                <w:bCs w:val="false"/>
+                <w:color w:val="1A1A1A"/>
+                <w:sz w:val="19"/>
+                <w:szCs w:val="19"/>
+              </w:rPr>
+              <w:t xml:space="preserve">Z</w:t>
+            </w:r>
+          </w:p>
+        </w:tc>
+        <w:tc>
+          <w:tcPr>
+            <w:tcW w:type="dxa" w:w="1872"/>
+            <w:tcMar>
+              <w:top w:type="dxa" w:w="80"/>
+              <w:left w:type="dxa" w:w="110"/>
+              <w:bottom w:type="dxa" w:w="80"/>
+              <w:right w:type="dxa" w:w="110"/>
+            </w:tcMar>
+          </w:tcPr>
+          <w:p>
+            <w:pPr>
+              <w:spacing w:after="0" w:line="264"/>
+            </w:pPr>
+            <w:r>
+              <w:rPr>
+                <w:b w:val="false"/>
+                <w:bCs w:val="false"/>
+                <w:color w:val="1A1A1A"/>
+                <w:sz w:val="19"/>
+                <w:szCs w:val="19"/>
+              </w:rPr>
+              <w:t xml:space="preserve">dezembro</w:t>
+            </w:r>
+          </w:p>
+        </w:tc>
+        <w:tc>
+          <w:tcPr>
+            <w:tcW w:type="dxa" w:w="6178"/>
+            <w:tcMar>
+              <w:top w:type="dxa" w:w="80"/>
+              <w:left w:type="dxa" w:w="110"/>
+              <w:bottom w:type="dxa" w:w="80"/>
+              <w:right w:type="dxa" w:w="110"/>
+            </w:tcMar>
+          </w:tcPr>
+          <w:p>
+            <w:pPr>
+              <w:spacing w:after="0" w:line="264"/>
+            </w:pPr>
+            <w:r>
+              <w:rPr>
+                <w:b w:val="false"/>
+                <w:bCs w:val="false"/>
+                <w:color w:val="1A1A1A"/>
+                <w:sz w:val="19"/>
+                <w:szCs w:val="19"/>
+              </w:rPr>
+              <w:t xml:space="preserve">Safra nova americana, o contrato de referência do milho</w:t>
+            </w:r>
+          </w:p>
+        </w:tc>
+      </w:tr>
+    </w:tbl>
+    <w:p>
+      <w:pPr>
+        <w:spacing w:after="100"/>
+      </w:pPr>
+    </w:p>
+    <w:p>
+      <w:pPr>
+        <w:spacing w:after="120" w:line="276"/>
+      </w:pPr>
+      <w:r>
+        <w:rPr>
+          <w:color w:val="1A1A1A"/>
+          <w:sz w:val="21"/>
+          <w:szCs w:val="21"/>
+        </w:rPr>
         <w:t xml:space="preserve">O algoritmo gera os próximos sete vencimentos a partir do mês corrente, com uma regra de corte: passado o dia 15, o contrato do mês corrente é descartado, porque está próximo demais do vencimento e a liquidez migrou. O símbolo é montado como o prefixo da commodity, o código do mês, o ano com dois dígitos e o sufixo da bolsa.</w:t>
+      </w:r>
+    </w:p>
+    <w:p>
+      <w:pPr>
+        <w:spacing w:after="120" w:line="276"/>
+      </w:pPr>
+      <w:r>
+        <w:rPr>
+          <w:color w:val="1A1A1A"/>
+          <w:sz w:val="21"/>
+          <w:szCs w:val="21"/>
+        </w:rPr>
+        <w:t xml:space="preserve">As duas curvas são buscadas numa requisição só. O endpoint que devolve posições em aberto exige cookie e crumb, e o Yahoo limita por IP — os IPs do GitHub Actions batem no limite com facilidade, então o par de autenticação é obtido uma vez por execução e reaproveitado entre os coletores.</w:t>
+      </w:r>
+    </w:p>
+    <w:p>
+      <w:pPr>
+        <w:spacing w:after="120" w:line="276"/>
+      </w:pPr>
+      <w:r>
+        <w:rPr>
+          <w:color w:val="1A1A1A"/>
+          <w:sz w:val="21"/>
+          <w:szCs w:val="21"/>
+        </w:rPr>
+        <w:t xml:space="preserve">Cada contrato guarda também o spread para o vencimento anterior. Positivo é carrego: o mercado paga para estocar. Negativo é inversão: o mercado quer o grão agora. Além de ser a base da decisão de armazenagem, é esse número que explica o degrau descrito a seguir.</w:t>
       </w:r>
     </w:p>
     <w:p>
@@ -7969,7 +8530,344 @@
           <w:sz w:val="24"/>
           <w:szCs w:val="24"/>
         </w:rPr>
-        <w:t xml:space="preserve">8.5 Séries temporais e variações multi-horizonte</w:t>
+        <w:t xml:space="preserve">8.5 Contínuos e contratos: a armadilha da emenda</w:t>
+      </w:r>
+    </w:p>
+    <w:p>
+      <w:pPr>
+        <w:spacing w:after="120" w:line="276"/>
+      </w:pPr>
+      <w:r>
+        <w:rPr>
+          <w:color w:val="1A1A1A"/>
+          <w:sz w:val="21"/>
+          <w:szCs w:val="21"/>
+        </w:rPr>
+        <w:t xml:space="preserve">Os cartões de cotação usam símbolos terminados em “=F” — ZS=F, ZC=F, ZW=F, ZM=F, ZL=F, BZ=F. Nenhum deles é um contrato. São séries contínuas: apontam para o vencimento ativo e trocam de contrato sozinhas quando ele se aproxima do vencimento.</w:t>
+      </w:r>
+    </w:p>
+    <w:p>
+      <w:pPr>
+        <w:spacing w:after="120" w:line="276"/>
+      </w:pPr>
+      <w:r>
+        <w:rPr>
+          <w:color w:val="1A1A1A"/>
+          <w:sz w:val="21"/>
+          <w:szCs w:val="21"/>
+        </w:rPr>
+        <w:t xml:space="preserve">O problema é como a troca aparece na série histórica. O Yahoo emenda o contrato novo no lugar do velho sem retroajustar os preços anteriores. Como vencimentos diferentes negociam a preços diferentes, no dia da rolagem a série dá um degrau que não corresponde a nenhum movimento de mercado.</w:t>
+      </w:r>
+    </w:p>
+    <w:p>
+      <w:pPr>
+        <w:spacing w:after="120" w:line="276"/>
+      </w:pPr>
+      <w:r>
+        <w:rPr>
+          <w:color w:val="1A1A1A"/>
+          <w:sz w:val="21"/>
+          <w:szCs w:val="21"/>
+        </w:rPr>
+        <w:t xml:space="preserve">O caso que motivou a correção: em 25 de agosto de 2026 o ZC=F passou de setembro para dezembro de 2026. O fechamento anterior era 491,50 ¢/bu e o novo, 523,25 — um salto de 31,75 ¢, que o painel exibia como alta de 6,46% num único dia. Três sinais mostravam que era emenda, não mercado:</w:t>
+      </w:r>
+    </w:p>
+    <w:tbl>
+      <w:tblPr>
+        <w:tblW w:type="dxa" w:w="9360"/>
+        <w:tblBorders>
+          <w:top w:val="single" w:color="D5D5CE" w:sz="2"/>
+          <w:left w:val="single" w:color="D5D5CE" w:sz="2"/>
+          <w:bottom w:val="single" w:color="D5D5CE" w:sz="2"/>
+          <w:right w:val="single" w:color="D5D5CE" w:sz="2"/>
+          <w:insideH w:val="single" w:color="E6E6E0" w:sz="2"/>
+          <w:insideV w:val="single" w:color="E6E6E0" w:sz="2"/>
+        </w:tblBorders>
+      </w:tblPr>
+      <w:tblGrid>
+        <w:gridCol w:w="3182"/>
+        <w:gridCol w:w="6178"/>
+      </w:tblGrid>
+      <w:tr>
+        <w:trPr>
+          <w:tblHeader/>
+        </w:trPr>
+        <w:tc>
+          <w:tcPr>
+            <w:tcW w:type="dxa" w:w="3182"/>
+            <w:shd w:fill="EDF2ED" w:color="auto" w:val="clear"/>
+            <w:tcMar>
+              <w:top w:type="dxa" w:w="80"/>
+              <w:left w:type="dxa" w:w="110"/>
+              <w:bottom w:type="dxa" w:w="80"/>
+              <w:right w:type="dxa" w:w="110"/>
+            </w:tcMar>
+          </w:tcPr>
+          <w:p>
+            <w:pPr>
+              <w:spacing w:after="0" w:line="264"/>
+            </w:pPr>
+            <w:r>
+              <w:rPr>
+                <w:b/>
+                <w:bCs/>
+                <w:color w:val="2E6B3E"/>
+                <w:sz w:val="19"/>
+                <w:szCs w:val="19"/>
+              </w:rPr>
+              <w:t xml:space="preserve">Sinal</w:t>
+            </w:r>
+          </w:p>
+        </w:tc>
+        <w:tc>
+          <w:tcPr>
+            <w:tcW w:type="dxa" w:w="6178"/>
+            <w:shd w:fill="EDF2ED" w:color="auto" w:val="clear"/>
+            <w:tcMar>
+              <w:top w:type="dxa" w:w="80"/>
+              <w:left w:type="dxa" w:w="110"/>
+              <w:bottom w:type="dxa" w:w="80"/>
+              <w:right w:type="dxa" w:w="110"/>
+            </w:tcMar>
+          </w:tcPr>
+          <w:p>
+            <w:pPr>
+              <w:spacing w:after="0" w:line="264"/>
+            </w:pPr>
+            <w:r>
+              <w:rPr>
+                <w:b/>
+                <w:bCs/>
+                <w:color w:val="2E6B3E"/>
+                <w:sz w:val="19"/>
+                <w:szCs w:val="19"/>
+              </w:rPr>
+              <w:t xml:space="preserve">O que mostrava</w:t>
+            </w:r>
+          </w:p>
+        </w:tc>
+      </w:tr>
+      <w:tr>
+        <w:tc>
+          <w:tcPr>
+            <w:tcW w:type="dxa" w:w="3182"/>
+            <w:tcMar>
+              <w:top w:type="dxa" w:w="80"/>
+              <w:left w:type="dxa" w:w="110"/>
+              <w:bottom w:type="dxa" w:w="80"/>
+              <w:right w:type="dxa" w:w="110"/>
+            </w:tcMar>
+          </w:tcPr>
+          <w:p>
+            <w:pPr>
+              <w:spacing w:after="0" w:line="264"/>
+            </w:pPr>
+            <w:r>
+              <w:rPr>
+                <w:b w:val="false"/>
+                <w:bCs w:val="false"/>
+                <w:color w:val="1A1A1A"/>
+                <w:sz w:val="19"/>
+                <w:szCs w:val="19"/>
+              </w:rPr>
+              <w:t xml:space="preserve">Magnitude</w:t>
+            </w:r>
+          </w:p>
+        </w:tc>
+        <w:tc>
+          <w:tcPr>
+            <w:tcW w:type="dxa" w:w="6178"/>
+            <w:tcMar>
+              <w:top w:type="dxa" w:w="80"/>
+              <w:left w:type="dxa" w:w="110"/>
+              <w:bottom w:type="dxa" w:w="80"/>
+              <w:right w:type="dxa" w:w="110"/>
+            </w:tcMar>
+          </w:tcPr>
+          <w:p>
+            <w:pPr>
+              <w:spacing w:after="0" w:line="264"/>
+            </w:pPr>
+            <w:r>
+              <w:rPr>
+                <w:b w:val="false"/>
+                <w:bCs w:val="false"/>
+                <w:color w:val="1A1A1A"/>
+                <w:sz w:val="19"/>
+                <w:szCs w:val="19"/>
+              </w:rPr>
+              <w:t xml:space="preserve">6,46% num dia excede o percentil 99 do próprio milho no último ano (5,44%), contra mediana diária de 0,75%</w:t>
+            </w:r>
+          </w:p>
+        </w:tc>
+      </w:tr>
+      <w:tr>
+        <w:tc>
+          <w:tcPr>
+            <w:tcW w:type="dxa" w:w="3182"/>
+            <w:tcMar>
+              <w:top w:type="dxa" w:w="80"/>
+              <w:left w:type="dxa" w:w="110"/>
+              <w:bottom w:type="dxa" w:w="80"/>
+              <w:right w:type="dxa" w:w="110"/>
+            </w:tcMar>
+          </w:tcPr>
+          <w:p>
+            <w:pPr>
+              <w:spacing w:after="0" w:line="264"/>
+            </w:pPr>
+            <w:r>
+              <w:rPr>
+                <w:b w:val="false"/>
+                <w:bCs w:val="false"/>
+                <w:color w:val="1A1A1A"/>
+                <w:sz w:val="19"/>
+                <w:szCs w:val="19"/>
+              </w:rPr>
+              <w:t xml:space="preserve">Intradiário</w:t>
+            </w:r>
+          </w:p>
+        </w:tc>
+        <w:tc>
+          <w:tcPr>
+            <w:tcW w:type="dxa" w:w="6178"/>
+            <w:tcMar>
+              <w:top w:type="dxa" w:w="80"/>
+              <w:left w:type="dxa" w:w="110"/>
+              <w:bottom w:type="dxa" w:w="80"/>
+              <w:right w:type="dxa" w:w="110"/>
+            </w:tcMar>
+          </w:tcPr>
+          <w:p>
+            <w:pPr>
+              <w:spacing w:after="0" w:line="264"/>
+            </w:pPr>
+            <w:r>
+              <w:rPr>
+                <w:b w:val="false"/>
+                <w:bCs w:val="false"/>
+                <w:color w:val="1A1A1A"/>
+                <w:sz w:val="19"/>
+                <w:szCs w:val="19"/>
+              </w:rPr>
+              <w:t xml:space="preserve">Nenhum salto: a sessão inteira negociou entre 513 e 523, ou seja, abriu já no patamar novo</w:t>
+            </w:r>
+          </w:p>
+        </w:tc>
+      </w:tr>
+      <w:tr>
+        <w:tc>
+          <w:tcPr>
+            <w:tcW w:type="dxa" w:w="3182"/>
+            <w:tcMar>
+              <w:top w:type="dxa" w:w="80"/>
+              <w:left w:type="dxa" w:w="110"/>
+              <w:bottom w:type="dxa" w:w="80"/>
+              <w:right w:type="dxa" w:w="110"/>
+            </w:tcMar>
+          </w:tcPr>
+          <w:p>
+            <w:pPr>
+              <w:spacing w:after="0" w:line="264"/>
+            </w:pPr>
+            <w:r>
+              <w:rPr>
+                <w:b w:val="false"/>
+                <w:bCs w:val="false"/>
+                <w:color w:val="1A1A1A"/>
+                <w:sz w:val="19"/>
+                <w:szCs w:val="19"/>
+              </w:rPr>
+              <w:t xml:space="preserve">Spread</w:t>
+            </w:r>
+          </w:p>
+        </w:tc>
+        <w:tc>
+          <w:tcPr>
+            <w:tcW w:type="dxa" w:w="6178"/>
+            <w:tcMar>
+              <w:top w:type="dxa" w:w="80"/>
+              <w:left w:type="dxa" w:w="110"/>
+              <w:bottom w:type="dxa" w:w="80"/>
+              <w:right w:type="dxa" w:w="110"/>
+            </w:tcMar>
+          </w:tcPr>
+          <w:p>
+            <w:pPr>
+              <w:spacing w:after="0" w:line="264"/>
+            </w:pPr>
+            <w:r>
+              <w:rPr>
+                <w:b w:val="false"/>
+                <w:bCs w:val="false"/>
+                <w:color w:val="1A1A1A"/>
+                <w:sz w:val="19"/>
+                <w:szCs w:val="19"/>
+              </w:rPr>
+              <w:t xml:space="preserve">+31,75 ¢ é exatamente o carrego setembro→dezembro do milho, cerca de 10 a 11 ¢ por mês</w:t>
+            </w:r>
+          </w:p>
+        </w:tc>
+      </w:tr>
+    </w:tbl>
+    <w:p>
+      <w:pPr>
+        <w:spacing w:after="100"/>
+      </w:pPr>
+    </w:p>
+    <w:p>
+      <w:pPr>
+        <w:spacing w:after="120" w:line="276"/>
+      </w:pPr>
+      <w:r>
+        <w:rPr>
+          <w:color w:val="1A1A1A"/>
+          <w:sz w:val="21"/>
+          <w:szCs w:val="21"/>
+        </w:rPr>
+        <w:t xml:space="preserve">A correção tem três partes. A variação do dia passou a vir do endpoint de cotação, que compara o contrato com o fechamento dele mesmo e por isso é imune à emenda. O campo que nomeia o contrato por trás do contínuo passou a ser gravado, e o painel exibe o vencimento ao lado do nome em cada cartão — “Milho CBOT · dez/26”. E a curva de vencimentos, que antes só existia para a soja, passou a cobrir o milho: com setembro e dezembro visíveis lado a lado, o degrau deixa de ser uma alta fantasma e vira o que sempre foi, um spread de calendário.</w:t>
+      </w:r>
+    </w:p>
+    <w:p>
+      <w:pPr>
+        <w:spacing w:after="120" w:line="276"/>
+      </w:pPr>
+      <w:r>
+        <w:rPr>
+          <w:color w:val="1A1A1A"/>
+          <w:sz w:val="21"/>
+          <w:szCs w:val="21"/>
+        </w:rPr>
+        <w:t xml:space="preserve">O que continua em aberto: as variações de mais de um dia (semana, mês, trimestre, ano, cinco anos) ainda saem da série emendada e ainda carregam os degraus das rolagens passadas. Retroajustar exige saber a data de cada rolagem, e nenhuma fonte gratuita publica esse histórico. O painel passou a acumular esse registro por conta própria, um por dia, no mesmo modelo da série do basis — daqui a alguns meses o retroajuste fica possível. Enquanto isso, a ressalva aparece no rodapé do gráfico.</w:t>
+      </w:r>
+    </w:p>
+    <w:p>
+      <w:pPr>
+        <w:spacing w:after="120" w:line="276"/>
+      </w:pPr>
+      <w:r>
+        <w:rPr>
+          <w:color w:val="1A1A1A"/>
+          <w:sz w:val="21"/>
+          <w:szCs w:val="21"/>
+        </w:rPr>
+        <w:t xml:space="preserve">Vale lembrar que o milho não usa o mesmo fator de conversão da soja: o bushel de milho pesa 56 libras contra 60 da soja, como registra a tabela de conversões da seção 8.2. Converter milho em reais por saca com a constante da soja subestima o valor em cerca de 7%.</w:t>
+      </w:r>
+    </w:p>
+    <w:p>
+      <w:pPr>
+        <w:pStyle w:val="Heading2"/>
+        <w:spacing w:after="110" w:before="240"/>
+      </w:pPr>
+      <w:r>
+        <w:rPr>
+          <w:b/>
+          <w:bCs/>
+          <w:color w:val="1A1A1A"/>
+          <w:sz w:val="24"/>
+          <w:szCs w:val="24"/>
+        </w:rPr>
+        <w:t xml:space="preserve">8.6 Séries temporais e variações multi-horizonte</w:t>
       </w:r>
     </w:p>
     <w:p>
@@ -8556,7 +9454,7 @@
           <w:sz w:val="24"/>
           <w:szCs w:val="24"/>
         </w:rPr>
-        <w:t xml:space="preserve">8.6 Renderização dos gráficos no navegador</w:t>
+        <w:t xml:space="preserve">8.7 Renderização dos gráficos no navegador</w:t>
       </w:r>
     </w:p>
     <w:p>
@@ -8704,7 +9602,7 @@
           <w:sz w:val="24"/>
           <w:szCs w:val="24"/>
         </w:rPr>
-        <w:t xml:space="preserve">8.7 Balanço de oferta e demanda</w:t>
+        <w:t xml:space="preserve">8.8 Balanço de oferta e demanda</w:t>
       </w:r>
     </w:p>
     <w:p>
@@ -8987,7 +9885,7 @@
           <w:sz w:val="24"/>
           <w:szCs w:val="24"/>
         </w:rPr>
-        <w:t xml:space="preserve">8.8 Extração de dados semiestruturados</w:t>
+        <w:t xml:space="preserve">8.9 Extração de dados semiestruturados</w:t>
       </w:r>
     </w:p>
     <w:p>
@@ -9155,7 +10053,7 @@
           <w:sz w:val="24"/>
           <w:szCs w:val="24"/>
         </w:rPr>
-        <w:t xml:space="preserve">8.9 Robustez de rede</w:t>
+        <w:t xml:space="preserve">8.10 Robustez de rede</w:t>
       </w:r>
     </w:p>
     <w:tbl>
@@ -9522,7 +10420,7 @@
           <w:sz w:val="24"/>
           <w:szCs w:val="24"/>
         </w:rPr>
-        <w:t xml:space="preserve">8.10 Modelo de direção de preço (especificado, não implementado)</w:t>
+        <w:t xml:space="preserve">8.11 Modelo de direção de preço (especificado, não implementado)</w:t>
       </w:r>
     </w:p>
     <w:p>
@@ -10303,7 +11201,7 @@
           <w:sz w:val="24"/>
           <w:szCs w:val="24"/>
         </w:rPr>
-        <w:t xml:space="preserve">8.11 Densidade risco-neutra (bloqueado por falta de dados)</w:t>
+        <w:t xml:space="preserve">8.12 Densidade risco-neutra (bloqueado por falta de dados)</w:t>
       </w:r>
     </w:p>
     <w:p>
@@ -10888,6 +11786,34 @@
           <w:szCs w:val="21"/>
         </w:rPr>
         <w:t xml:space="preserve"> — não existe arquivo gratuito do indicador para reconstruir o histórico. A série útil ao modelo se forma a partir de sua criação.</w:t>
+      </w:r>
+    </w:p>
+    <w:p>
+      <w:pPr>
+        <w:pStyle w:val="ListParagraph"/>
+        <w:numPr>
+          <w:ilvl w:val="0"/>
+          <w:numId w:val="2"/>
+        </w:numPr>
+        <w:spacing w:after="70" w:line="276"/>
+      </w:pPr>
+      <w:r>
+        <w:rPr>
+          <w:b/>
+          <w:bCs/>
+          <w:color w:val="1A1A1A"/>
+          <w:sz w:val="21"/>
+          <w:szCs w:val="21"/>
+        </w:rPr>
+        <w:t xml:space="preserve">Variações longas dos contínuos incluem a emenda de vencimento</w:t>
+      </w:r>
+      <w:r>
+        <w:rPr>
+          <w:color w:val="1A1A1A"/>
+          <w:sz w:val="21"/>
+          <w:szCs w:val="21"/>
+        </w:rPr>
+        <w:t xml:space="preserve"> — as séries de mais de um dia dos símbolos contínuos carregam os degraus das trocas de contrato, porque a fonte emenda sem retroajustar. A variação do dia já vem corrigida e cada cartão nomeia o contrato; o retroajuste do histórico depende do registro de rolagens que o painel passou a acumular. Detalhado na seção 8.5.</w:t>
       </w:r>
     </w:p>
     <w:p>
@@ -17991,7 +18917,7 @@
           <w:sz w:val="18"/>
           <w:szCs w:val="18"/>
         </w:rPr>
-        <w:t xml:space="preserve">Documento gerado a partir do estado do repositório em 24/08/2026. O painel evolui continuamente; o README do repositório é a referência sempre atualizada sobre fontes e operação.</w:t>
+        <w:t xml:space="preserve">Documento gerado a partir do estado do repositório em 25/08/2026. O painel evolui continuamente; o README do repositório é a referência sempre atualizada sobre fontes e operação.</w:t>
       </w:r>
     </w:p>
     <w:p>

</xml_diff>